<commit_message>
Widen TOTAL banner in Nigeria templates to fit large totals
The purple TOTAL banner was sized at ~200pt wide with a fixed 22.8pt
height and noAutofit. With totals now in the millions (per-user × users
× months), the value wrapped onto a second line that got clipped by the
fixed height.

Shifted the banner 100pt leftward and widened it by 100pt so the right
edge stays aligned with the SUBTOTAL/VAT lines while giving the value
about 3x more horizontal room. Updated both the modern wps:wsp anchor
and the legacy v:rect fallback in both Plus and Standard Nigeria
templates.

After pulling this commit, run \`node scripts/upload-templates.js\` to
push the updated templates to Vercel Blob.

https://claude.ai/code/session_01X9gx8PxrKJLCzJB2qXKQ6C
</commit_message>
<xml_diff>
--- a/backend/templates/Plus_Template_Polished_Nigeria.docx
+++ b/backend/templates/Plus_Template_Polished_Nigeria.docx
@@ -1885,12 +1885,12 @@
               <wp:anchor behindDoc="1" distT="0" distB="0" distL="0" distR="0" simplePos="0" locked="0" layoutInCell="0" allowOverlap="1" relativeHeight="9">
                 <wp:simplePos x="0" y="0"/>
                 <wp:positionH relativeFrom="page">
-                  <wp:posOffset>4608830</wp:posOffset>
+                  <wp:posOffset>3338830</wp:posOffset>
                 </wp:positionH>
                 <wp:positionV relativeFrom="paragraph">
                   <wp:posOffset>255270</wp:posOffset>
                 </wp:positionV>
-                <wp:extent cx="2552700" cy="290195"/>
+                <wp:extent cx="3822700" cy="290195"/>
                 <wp:effectExtent l="0" t="0" r="0" b="0"/>
                 <wp:wrapTopAndBottom/>
                 <wp:docPr id="1" name="Textbox 4"/>
@@ -1901,7 +1901,7 @@
                       <wps:spPr>
                         <a:xfrm>
                           <a:off x="0" y="0"/>
-                          <a:ext cx="2552760" cy="290160"/>
+                          <a:ext cx="3822760" cy="290160"/>
                         </a:xfrm>
                         <a:prstGeom prst="rect">
                           <a:avLst/>
@@ -1985,7 +1985,7 @@
           </mc:Choice>
           <mc:Fallback>
             <w:pict>
-              <v:rect id="shape_0" ID="Textbox 4" path="m0,0l-2147483645,0l-2147483645,-2147483646l0,-2147483646xe" fillcolor="#8a2b8a" stroked="f" o:allowincell="f" style="position:absolute;margin-left:362.9pt;margin-top:20.1pt;width:200.95pt;height:22.8pt;mso-wrap-style:square;v-text-anchor:top;mso-position-horizontal-relative:page">
+              <v:rect id="shape_0" ID="Textbox 4" path="m0,0l-2147483645,0l-2147483645,-2147483646l0,-2147483646xe" fillcolor="#8a2b8a" stroked="f" o:allowincell="f" style="position:absolute;margin-left:262.9pt;margin-top:20.1pt;width:300.95pt;height:22.8pt;mso-wrap-style:square;v-text-anchor:top;mso-position-horizontal-relative:page">
                 <v:fill o:detectmouseclick="t" type="solid" color2="#75d475"/>
                 <v:stroke color="#3465a4" joinstyle="round" endcap="flat"/>
                 <v:textbox>

</xml_diff>

<commit_message>
Align SUBTOTAL/VAT/TOTAL rows in Nigeria templates
Switch the three amount lines to a shared label-left / value-right
geometry so they read as a clean column:

- SUBTOTAL and VAT paragraphs: jc=right with a right indent are now
  jc=left with a left indent at 6062 twips (label X = 339.1pt from
  page left) and a right-aligned tab at 10441 twips (value right
  edge at 558.05pt).
- TOTAL banner internal paragraph: left tab at 2634 becomes a right
  tab at 5903 twips so the value right-aligns at the same 558.05pt
  page X. Label stays at the existing 1524-twip indent which
  resolves to the same 339.1pt page X as SUBTOTAL/VAT.

Applied to both Plus and Standard Nigeria templates. Remember to
re-run \`node scripts/upload-templates.js\` after merging.

https://claude.ai/code/session_01X9gx8PxrKJLCzJB2qXKQ6C
</commit_message>
<xml_diff>
--- a/backend/templates/Plus_Template_Polished_Nigeria.docx
+++ b/backend/templates/Plus_Template_Polished_Nigeria.docx
@@ -1831,10 +1831,10 @@
         <w:pStyle w:val="Heading2"/>
         <w:tabs>
           <w:tab w:val="clear" w:pos="720"/>
-          <w:tab w:val="left" w:pos="1203" w:leader="none"/>
+          <w:tab w:val="right" w:pos="10441" w:leader="none"/>
         </w:tabs>
-        <w:ind w:left="0" w:right="359"/>
-        <w:jc w:val="right"/>
+        <w:ind w:left="6062" w:right="0"/>
+        <w:jc w:val="left"/>
         <w:rPr/>
       </w:pPr>
       <w:r>
@@ -1869,11 +1869,11 @@
         <w:pStyle w:val="Normal"/>
         <w:tabs>
           <w:tab w:val="clear" w:pos="720"/>
-          <w:tab w:val="left" w:pos="1690" w:leader="none"/>
+          <w:tab w:val="right" w:pos="10441" w:leader="none"/>
         </w:tabs>
         <w:spacing w:before="120" w:after="0"/>
-        <w:ind w:hanging="0" w:left="0" w:right="358"/>
-        <w:jc w:val="right"/>
+        <w:ind w:hanging="0" w:left="6062" w:right="0"/>
+        <w:jc w:val="left"/>
         <w:rPr>
           <w:sz w:val="19"/>
         </w:rPr>
@@ -1926,7 +1926,7 @@
                               <w:pStyle w:val="FrameContentsuser"/>
                               <w:tabs>
                                 <w:tab w:val="clear" w:pos="720"/>
-                                <w:tab w:val="left" w:pos="2634" w:leader="none"/>
+                                <w:tab w:val="right" w:pos="5903" w:leader="none"/>
                               </w:tabs>
                               <w:spacing w:before="110" w:after="0"/>
                               <w:ind w:hanging="0" w:left="1524" w:right="0"/>
@@ -1995,7 +1995,7 @@
                         <w:pStyle w:val="FrameContentsuser"/>
                         <w:tabs>
                           <w:tab w:val="clear" w:pos="720"/>
-                          <w:tab w:val="left" w:pos="2634" w:leader="none"/>
+                          <w:tab w:val="right" w:pos="5903" w:leader="none"/>
                         </w:tabs>
                         <w:spacing w:before="110" w:after="0"/>
                         <w:ind w:hanging="0" w:left="1524" w:right="0"/>

</xml_diff>

<commit_message>
Left-align values instead of right-aligning them
Revise the previous alignment commit: keep labels left-aligned at
339.1pt page X, but change the value tabs from right-aligned (ending
at a shared right edge) to left-aligned (starting at a shared left
edge of 447.9pt page X). That way all three NGN amounts begin at the
same column rather than ending at the same column.

SUBTOTAL/VAT tab: right @10441 -> left @8238 (value left X 447.9pt)
TOTAL banner tab: right @5903  -> left @3700 (value left X 447.9pt)

https://claude.ai/code/session_01X9gx8PxrKJLCzJB2qXKQ6C
</commit_message>
<xml_diff>
--- a/backend/templates/Plus_Template_Polished_Nigeria.docx
+++ b/backend/templates/Plus_Template_Polished_Nigeria.docx
@@ -1831,7 +1831,7 @@
         <w:pStyle w:val="Heading2"/>
         <w:tabs>
           <w:tab w:val="clear" w:pos="720"/>
-          <w:tab w:val="right" w:pos="10441" w:leader="none"/>
+          <w:tab w:val="left" w:pos="8238" w:leader="none"/>
         </w:tabs>
         <w:ind w:left="6062" w:right="0"/>
         <w:jc w:val="left"/>
@@ -1869,7 +1869,7 @@
         <w:pStyle w:val="Normal"/>
         <w:tabs>
           <w:tab w:val="clear" w:pos="720"/>
-          <w:tab w:val="right" w:pos="10441" w:leader="none"/>
+          <w:tab w:val="left" w:pos="8238" w:leader="none"/>
         </w:tabs>
         <w:spacing w:before="120" w:after="0"/>
         <w:ind w:hanging="0" w:left="6062" w:right="0"/>
@@ -1926,7 +1926,7 @@
                               <w:pStyle w:val="FrameContentsuser"/>
                               <w:tabs>
                                 <w:tab w:val="clear" w:pos="720"/>
-                                <w:tab w:val="right" w:pos="5903" w:leader="none"/>
+                                <w:tab w:val="left" w:pos="3700" w:leader="none"/>
                               </w:tabs>
                               <w:spacing w:before="110" w:after="0"/>
                               <w:ind w:hanging="0" w:left="1524" w:right="0"/>
@@ -1995,7 +1995,7 @@
                         <w:pStyle w:val="FrameContentsuser"/>
                         <w:tabs>
                           <w:tab w:val="clear" w:pos="720"/>
-                          <w:tab w:val="right" w:pos="5903" w:leader="none"/>
+                          <w:tab w:val="left" w:pos="3700" w:leader="none"/>
                         </w:tabs>
                         <w:spacing w:before="110" w:after="0"/>
                         <w:ind w:hanging="0" w:left="1524" w:right="0"/>

</xml_diff>

<commit_message>
Convert Nigeria totals to clean 3-row table matching Ghana
Replaces the floating "TOTAL" banner drawing and loose SUBTOTAL/VAT
paragraphs with a right-aligned table (SUBTOTAL, VAT 7.5%, TOTAL) using
the same column widths and TOTAL banner styling as the Ghana templates.
Color kept at 8A2B8A to match the Nigeria palette.
</commit_message>
<xml_diff>
--- a/backend/templates/Plus_Template_Polished_Nigeria.docx
+++ b/backend/templates/Plus_Template_Polished_Nigeria.docx
@@ -1826,290 +1826,190 @@
         </w:rPr>
       </w:r>
     </w:p>
-    <w:p>
-      <w:pPr>
-        <w:pStyle w:val="Heading2"/>
-        <w:tabs>
-          <w:tab w:val="clear" w:pos="720"/>
-          <w:tab w:val="left" w:pos="8238" w:leader="none"/>
-        </w:tabs>
-        <w:ind w:left="6062" w:right="0"/>
-        <w:jc w:val="left"/>
-        <w:rPr/>
-      </w:pPr>
-      <w:r>
-        <w:rPr>
-          <w:spacing w:val="-2"/>
-        </w:rPr>
-        <w:t>SUBTOTAL</w:t>
-      </w:r>
-      <w:r>
-        <w:rPr/>
-        <w:tab/>
-      </w:r>
-      <w:r>
-        <w:rPr/>
-        <w:t>NGN</w:t>
-      </w:r>
-      <w:r>
-        <w:rPr>
-          <w:spacing w:val="-4"/>
-        </w:rPr>
-        <w:t xml:space="preserve"> </w:t>
-      </w:r>
-      <w:r>
-        <w:rPr>
-          <w:spacing w:val="-2"/>
-        </w:rPr>
-        <w:t>{{SUBTOTAL}}</w:t>
-      </w:r>
-    </w:p>
-    <w:p>
-      <w:pPr>
-        <w:pStyle w:val="Normal"/>
-        <w:tabs>
-          <w:tab w:val="clear" w:pos="720"/>
-          <w:tab w:val="left" w:pos="8238" w:leader="none"/>
-        </w:tabs>
-        <w:spacing w:before="120" w:after="0"/>
-        <w:ind w:hanging="0" w:left="6062" w:right="0"/>
-        <w:jc w:val="left"/>
-        <w:rPr>
-          <w:sz w:val="19"/>
-        </w:rPr>
-      </w:pPr>
-      <w:r>
-        <mc:AlternateContent>
-          <mc:Choice Requires="wps">
-            <w:drawing>
-              <wp:anchor behindDoc="1" distT="0" distB="0" distL="0" distR="0" simplePos="0" locked="0" layoutInCell="0" allowOverlap="1" relativeHeight="9">
-                <wp:simplePos x="0" y="0"/>
-                <wp:positionH relativeFrom="page">
-                  <wp:posOffset>3338830</wp:posOffset>
-                </wp:positionH>
-                <wp:positionV relativeFrom="paragraph">
-                  <wp:posOffset>255270</wp:posOffset>
-                </wp:positionV>
-                <wp:extent cx="3822700" cy="290195"/>
-                <wp:effectExtent l="0" t="0" r="0" b="0"/>
-                <wp:wrapTopAndBottom/>
-                <wp:docPr id="1" name="Textbox 4"/>
-                <a:graphic xmlns:a="http://schemas.openxmlformats.org/drawingml/2006/main">
-                  <a:graphicData uri="http://schemas.microsoft.com/office/word/2010/wordprocessingShape">
-                    <wps:wsp>
-                      <wps:cNvSpPr/>
-                      <wps:spPr>
-                        <a:xfrm>
-                          <a:off x="0" y="0"/>
-                          <a:ext cx="3822760" cy="290160"/>
-                        </a:xfrm>
-                        <a:prstGeom prst="rect">
-                          <a:avLst/>
-                        </a:prstGeom>
-                        <a:solidFill>
-                          <a:srgbClr val="8a2b8a"/>
-                        </a:solidFill>
-                        <a:ln w="0">
-                          <a:noFill/>
-                        </a:ln>
-                      </wps:spPr>
-                      <wps:style>
-                        <a:lnRef idx="0"/>
-                        <a:fillRef idx="0"/>
-                        <a:effectRef idx="0"/>
-                        <a:fontRef idx="minor"/>
-                      </wps:style>
-                      <wps:txbx>
-                        <w:txbxContent>
-                          <w:p>
-                            <w:pPr>
-                              <w:pStyle w:val="FrameContentsuser"/>
-                              <w:tabs>
-                                <w:tab w:val="clear" w:pos="720"/>
-                                <w:tab w:val="left" w:pos="3700" w:leader="none"/>
-                              </w:tabs>
-                              <w:spacing w:before="110" w:after="0"/>
-                              <w:ind w:hanging="0" w:left="1524" w:right="0"/>
-                              <w:jc w:val="left"/>
-                              <w:rPr>
-                                <w:b/>
-                                <w:color w:val="000000"/>
-                                <w:sz w:val="21"/>
-                              </w:rPr>
-                            </w:pPr>
-                            <w:r>
-                              <w:rPr>
-                                <w:b/>
-                                <w:color w:val="FFFFFF"/>
-                                <w:spacing w:val="-2"/>
-                                <w:sz w:val="21"/>
-                              </w:rPr>
-                              <w:t>TOTAL</w:t>
-                            </w:r>
-                            <w:r>
-                              <w:rPr>
-                                <w:b/>
-                                <w:color w:val="FFFFFF"/>
-                                <w:sz w:val="21"/>
-                              </w:rPr>
-                              <w:tab/>
-                            </w:r>
-                            <w:r>
-                              <w:rPr>
-                                <w:b/>
-                                <w:color w:val="FFFFFF"/>
-                                <w:sz w:val="21"/>
-                              </w:rPr>
-                              <w:t>NGN</w:t>
-                            </w:r>
-                            <w:r>
-                              <w:rPr>
-                                <w:b/>
-                                <w:color w:val="FFFFFF"/>
-                                <w:spacing w:val="-2"/>
-                                <w:sz w:val="21"/>
-                              </w:rPr>
-                              <w:t xml:space="preserve"> {{TOTAL}}</w:t>
-                            </w:r>
-                          </w:p>
-                        </w:txbxContent>
-                      </wps:txbx>
-                      <wps:bodyPr lIns="0" rIns="0" tIns="0" bIns="0" anchor="t">
-                        <a:noAutofit/>
-                      </wps:bodyPr>
-                    </wps:wsp>
-                  </a:graphicData>
-                </a:graphic>
-              </wp:anchor>
-            </w:drawing>
-          </mc:Choice>
-          <mc:Fallback>
-            <w:pict>
-              <v:rect id="shape_0" ID="Textbox 4" path="m0,0l-2147483645,0l-2147483645,-2147483646l0,-2147483646xe" fillcolor="#8a2b8a" stroked="f" o:allowincell="f" style="position:absolute;margin-left:262.9pt;margin-top:20.1pt;width:300.95pt;height:22.8pt;mso-wrap-style:square;v-text-anchor:top;mso-position-horizontal-relative:page">
-                <v:fill o:detectmouseclick="t" type="solid" color2="#75d475"/>
-                <v:stroke color="#3465a4" joinstyle="round" endcap="flat"/>
-                <v:textbox>
-                  <w:txbxContent>
-                    <w:p>
-                      <w:pPr>
-                        <w:pStyle w:val="FrameContentsuser"/>
-                        <w:tabs>
-                          <w:tab w:val="clear" w:pos="720"/>
-                          <w:tab w:val="left" w:pos="3700" w:leader="none"/>
-                        </w:tabs>
-                        <w:spacing w:before="110" w:after="0"/>
-                        <w:ind w:hanging="0" w:left="1524" w:right="0"/>
-                        <w:jc w:val="left"/>
-                        <w:rPr>
-                          <w:b/>
-                          <w:color w:val="000000"/>
-                          <w:sz w:val="21"/>
-                        </w:rPr>
-                      </w:pPr>
-                      <w:r>
-                        <w:rPr>
-                          <w:b/>
-                          <w:color w:val="FFFFFF"/>
-                          <w:spacing w:val="-2"/>
-                          <w:sz w:val="21"/>
-                        </w:rPr>
-                        <w:t>TOTAL</w:t>
-                      </w:r>
-                      <w:r>
-                        <w:rPr>
-                          <w:b/>
-                          <w:color w:val="FFFFFF"/>
-                          <w:sz w:val="21"/>
-                        </w:rPr>
-                        <w:tab/>
-                      </w:r>
-                      <w:r>
-                        <w:rPr>
-                          <w:b/>
-                          <w:color w:val="FFFFFF"/>
-                          <w:sz w:val="21"/>
-                        </w:rPr>
-                        <w:t>NGN</w:t>
-                      </w:r>
-                      <w:r>
-                        <w:rPr>
-                          <w:b/>
-                          <w:color w:val="FFFFFF"/>
-                          <w:spacing w:val="-2"/>
-                          <w:sz w:val="21"/>
-                        </w:rPr>
-                        <w:t xml:space="preserve"> {{TOTAL}}</w:t>
-                      </w:r>
-                    </w:p>
-                  </w:txbxContent>
-                </v:textbox>
-                <w10:wrap type="topAndBottom"/>
-              </v:rect>
-            </w:pict>
-          </mc:Fallback>
-        </mc:AlternateContent>
-      </w:r>
-      <w:r>
-        <w:rPr>
-          <w:i/>
-          <w:sz w:val="19"/>
-        </w:rPr>
-        <w:t>VAT</w:t>
-      </w:r>
-      <w:r>
-        <w:rPr>
-          <w:i/>
-          <w:spacing w:val="-2"/>
-          <w:sz w:val="19"/>
-        </w:rPr>
-        <w:t xml:space="preserve"> (</w:t>
-      </w:r>
-      <w:r>
-        <w:rPr>
-          <w:i/>
-          <w:spacing w:val="-2"/>
-          <w:sz w:val="19"/>
-        </w:rPr>
-        <w:t>7.</w:t>
-      </w:r>
-      <w:r>
-        <w:rPr>
-          <w:i/>
-          <w:spacing w:val="-2"/>
-          <w:sz w:val="19"/>
-        </w:rPr>
-        <w:t>5</w:t>
-      </w:r>
-      <w:r>
-        <w:rPr>
-          <w:i/>
-          <w:spacing w:val="-2"/>
-          <w:sz w:val="19"/>
-        </w:rPr>
-        <w:t>%)</w:t>
-      </w:r>
-      <w:r>
-        <w:rPr>
-          <w:i/>
-          <w:sz w:val="19"/>
-        </w:rPr>
-        <w:tab/>
-      </w:r>
-      <w:r>
-        <w:rPr>
-          <w:i/>
-          <w:sz w:val="19"/>
-        </w:rPr>
-        <w:t>NGN</w:t>
-      </w:r>
-      <w:r>
-        <w:rPr>
-          <w:spacing w:val="-2"/>
-          <w:sz w:val="19"/>
-        </w:rPr>
-        <w:t xml:space="preserve"> {{VAT}}</w:t>
-      </w:r>
-    </w:p>
+    <w:tbl>
+      <w:tblPr>
+        <w:tblW w:w="4000" w:type="dxa"/>
+        <w:jc w:val="right"/>
+        <w:tblInd w:w="0" w:type="dxa"/>
+        <w:tblLayout w:type="fixed"/>
+        <w:tblCellMar>
+          <w:top w:w="60" w:type="dxa"/>
+          <w:left w:w="108" w:type="dxa"/>
+          <w:bottom w:w="60" w:type="dxa"/>
+          <w:right w:w="120" w:type="dxa"/>
+        </w:tblCellMar>
+        <w:tblLook w:val="0000"/>
+      </w:tblPr>
+      <w:tblGrid>
+        <w:gridCol w:w="2200"/>
+        <w:gridCol w:w="1799"/>
+      </w:tblGrid>
+      <w:tr>
+        <w:trPr/>
+        <w:tc>
+          <w:tcPr>
+            <w:tcW w:w="2200" w:type="dxa"/>
+            <w:tcBorders/>
+          </w:tcPr>
+          <w:p>
+            <w:pPr>
+              <w:pStyle w:val="Normal"/>
+              <w:jc w:val="right"/>
+              <w:rPr/>
+            </w:pPr>
+            <w:r>
+              <w:rPr>
+                <w:sz w:val="19"/>
+                <w:szCs w:val="19"/>
+              </w:rPr>
+              <w:t>SUBTOTAL</w:t>
+            </w:r>
+          </w:p>
+        </w:tc>
+        <w:tc>
+          <w:tcPr>
+            <w:tcW w:w="1799" w:type="dxa"/>
+            <w:tcBorders/>
+            <w:tcMar>
+              <w:left w:w="120" w:type="dxa"/>
+              <w:right w:w="108" w:type="dxa"/>
+            </w:tcMar>
+          </w:tcPr>
+          <w:p>
+            <w:pPr>
+              <w:pStyle w:val="Normal"/>
+              <w:jc w:val="right"/>
+              <w:rPr/>
+            </w:pPr>
+            <w:r>
+              <w:rPr>
+                <w:sz w:val="19"/>
+                <w:szCs w:val="19"/>
+              </w:rPr>
+              <w:t xml:space="preserve">NGN {{SUBTOTAL}}</w:t>
+            </w:r>
+          </w:p>
+        </w:tc>
+      </w:tr>
+      <w:tr>
+        <w:trPr/>
+        <w:tc>
+          <w:tcPr>
+            <w:tcW w:w="2200" w:type="dxa"/>
+            <w:tcBorders/>
+          </w:tcPr>
+          <w:p>
+            <w:pPr>
+              <w:pStyle w:val="Normal"/>
+              <w:jc w:val="right"/>
+              <w:rPr/>
+            </w:pPr>
+            <w:r>
+              <w:rPr>
+                <w:i/>
+                <w:iCs/>
+                <w:sz w:val="19"/>
+                <w:szCs w:val="19"/>
+              </w:rPr>
+              <w:t>VAT (7.5%)</w:t>
+            </w:r>
+          </w:p>
+        </w:tc>
+        <w:tc>
+          <w:tcPr>
+            <w:tcW w:w="1799" w:type="dxa"/>
+            <w:tcBorders/>
+            <w:tcMar>
+              <w:left w:w="120" w:type="dxa"/>
+              <w:right w:w="108" w:type="dxa"/>
+            </w:tcMar>
+          </w:tcPr>
+          <w:p>
+            <w:pPr>
+              <w:pStyle w:val="Normal"/>
+              <w:jc w:val="right"/>
+              <w:rPr/>
+            </w:pPr>
+            <w:r>
+              <w:rPr>
+                <w:sz w:val="19"/>
+                <w:szCs w:val="19"/>
+              </w:rPr>
+              <w:t xml:space="preserve">NGN {{VAT}}</w:t>
+            </w:r>
+          </w:p>
+        </w:tc>
+      </w:tr>
+      <w:tr>
+        <w:trPr/>
+        <w:tc>
+          <w:tcPr>
+            <w:tcW w:w="2200" w:type="dxa"/>
+            <w:tcBorders>
+              <w:top w:val="single" w:sz="8" w:space="0" w:color="8A2B8A"/>
+              <w:left w:val="single" w:sz="8" w:space="0" w:color="8A2B8A"/>
+              <w:bottom w:val="single" w:sz="8" w:space="0" w:color="8A2B8A"/>
+            </w:tcBorders>
+            <w:shd w:fill="8A2B8A" w:val="clear"/>
+            <w:tcMar>
+              <w:top w:w="80" w:type="dxa"/>
+              <w:bottom w:w="80" w:type="dxa"/>
+            </w:tcMar>
+          </w:tcPr>
+          <w:p>
+            <w:pPr>
+              <w:pStyle w:val="Normal"/>
+              <w:jc w:val="right"/>
+              <w:rPr/>
+            </w:pPr>
+            <w:r>
+              <w:rPr>
+                <w:b/>
+                <w:bCs/>
+                <w:color w:val="FFFFFF"/>
+                <w:sz w:val="21"/>
+                <w:szCs w:val="21"/>
+              </w:rPr>
+              <w:t>TOTAL</w:t>
+            </w:r>
+          </w:p>
+        </w:tc>
+        <w:tc>
+          <w:tcPr>
+            <w:tcW w:w="1799" w:type="dxa"/>
+            <w:tcBorders>
+              <w:top w:val="single" w:sz="8" w:space="0" w:color="8A2B8A"/>
+              <w:bottom w:val="single" w:sz="8" w:space="0" w:color="8A2B8A"/>
+              <w:right w:val="single" w:sz="8" w:space="0" w:color="8A2B8A"/>
+            </w:tcBorders>
+            <w:shd w:fill="8A2B8A" w:val="clear"/>
+            <w:tcMar>
+              <w:top w:w="80" w:type="dxa"/>
+              <w:left w:w="120" w:type="dxa"/>
+              <w:bottom w:w="80" w:type="dxa"/>
+              <w:right w:w="108" w:type="dxa"/>
+            </w:tcMar>
+          </w:tcPr>
+          <w:p>
+            <w:pPr>
+              <w:pStyle w:val="Normal"/>
+              <w:jc w:val="right"/>
+              <w:rPr/>
+            </w:pPr>
+            <w:r>
+              <w:rPr>
+                <w:b/>
+                <w:bCs/>
+                <w:color w:val="FFFFFF"/>
+                <w:sz w:val="21"/>
+                <w:szCs w:val="21"/>
+              </w:rPr>
+              <w:t xml:space="preserve">NGN {{TOTAL}}</w:t>
+            </w:r>
+          </w:p>
+        </w:tc>
+      </w:tr>
+    </w:tbl>
     <w:p>
       <w:pPr>
         <w:pStyle w:val="BodyText"/>

</xml_diff>